<commit_message>
Lab 4 - Prob D
Lab 4 - Prob D
</commit_message>
<xml_diff>
--- a/Assigment/Lab4/Lab4_Phuong Nguyen.docx
+++ b/Assigment/Lab4/Lab4_Phuong Nguyen.docx
@@ -305,35 +305,108 @@
           <w:numId w:val="1"/>
         </w:numPr>
         <w:rPr>
+          <w:b/>
+          <w:bCs/>
           <w:lang w:val="vi-VN"/>
         </w:rPr>
       </w:pPr>
       <w:r>
         <w:rPr>
+          <w:b/>
+          <w:bCs/>
           <w:lang w:val="en-US"/>
         </w:rPr>
         <w:t>S</w:t>
+      </w:r>
+      <w:r>
+        <w:rPr>
+          <w:b/>
+          <w:bCs/>
+          <w:lang w:val="en-US"/>
+        </w:rPr>
+        <w:t>equence diagram for Payroll Calculation</w:t>
       </w:r>
     </w:p>
     <w:p>
       <w:pPr>
-        <w:pStyle w:val="ListParagraph"/>
-        <w:rPr>
-          <w:lang w:val="vi-VN"/>
-        </w:rPr>
-      </w:pPr>
+        <w:rPr>
+          <w:lang w:val="en-US"/>
+        </w:rPr>
+      </w:pPr>
+      <w:r>
+        <w:rPr>
+          <w:lang w:val="en-US"/>
+        </w:rPr>
+        <w:drawing>
+          <wp:inline distT="0" distB="0" distL="0" distR="0" wp14:anchorId="64A5B92D" wp14:editId="606D8216">
+            <wp:extent cx="5943600" cy="4711065"/>
+            <wp:effectExtent l="0" t="0" r="0" b="635"/>
+            <wp:docPr id="1740720775" name="Picture 1"/>
+            <wp:cNvGraphicFramePr>
+              <a:graphicFrameLocks xmlns:a="http://schemas.openxmlformats.org/drawingml/2006/main" noChangeAspect="1"/>
+            </wp:cNvGraphicFramePr>
+            <a:graphic xmlns:a="http://schemas.openxmlformats.org/drawingml/2006/main">
+              <a:graphicData uri="http://schemas.openxmlformats.org/drawingml/2006/picture">
+                <pic:pic xmlns:pic="http://schemas.openxmlformats.org/drawingml/2006/picture">
+                  <pic:nvPicPr>
+                    <pic:cNvPr id="1740720775" name=""/>
+                    <pic:cNvPicPr/>
+                  </pic:nvPicPr>
+                  <pic:blipFill>
+                    <a:blip r:embed="rId10"/>
+                    <a:stretch>
+                      <a:fillRect/>
+                    </a:stretch>
+                  </pic:blipFill>
+                  <pic:spPr>
+                    <a:xfrm>
+                      <a:off x="0" y="0"/>
+                      <a:ext cx="5943600" cy="4711065"/>
+                    </a:xfrm>
+                    <a:prstGeom prst="rect">
+                      <a:avLst/>
+                    </a:prstGeom>
+                  </pic:spPr>
+                </pic:pic>
+              </a:graphicData>
+            </a:graphic>
+          </wp:inline>
+        </w:drawing>
+      </w:r>
     </w:p>
     <w:p>
       <w:pPr>
         <w:rPr>
+          <w:lang w:val="en-US"/>
+        </w:rPr>
+      </w:pPr>
+    </w:p>
+    <w:p>
+      <w:pPr>
+        <w:rPr>
+          <w:lang w:val="en-US"/>
+        </w:rPr>
+      </w:pPr>
+    </w:p>
+    <w:p>
+      <w:pPr>
+        <w:pStyle w:val="ListParagraph"/>
+        <w:rPr>
+          <w:lang w:val="vi-VN"/>
+        </w:rPr>
+      </w:pPr>
+    </w:p>
+    <w:p>
+      <w:pPr>
+        <w:rPr>
           <w:lang w:val="vi-VN"/>
         </w:rPr>
       </w:pPr>
     </w:p>
     <w:sectPr>
-      <w:headerReference w:type="default" r:id="rId10"/>
-      <w:footerReference w:type="even" r:id="rId11"/>
-      <w:footerReference w:type="default" r:id="rId12"/>
+      <w:headerReference w:type="default" r:id="rId11"/>
+      <w:footerReference w:type="even" r:id="rId12"/>
+      <w:footerReference w:type="default" r:id="rId13"/>
       <w:pgSz w:w="12240" w:h="15840"/>
       <w:pgMar w:top="1440" w:right="1440" w:bottom="1440" w:left="1440" w:header="708" w:footer="708" w:gutter="0"/>
       <w:cols w:space="708"/>
@@ -593,8 +666,8 @@
   <w:abstractNum w:abstractNumId="0" w15:restartNumberingAfterBreak="0">
     <w:nsid w:val="5A8154D6"/>
     <w:multiLevelType w:val="hybridMultilevel"/>
-    <w:tmpl w:val="66AE7BCC"/>
-    <w:lvl w:ilvl="0" w:tplc="04090015">
+    <w:tmpl w:val="86782C00"/>
+    <w:lvl w:ilvl="0" w:tplc="7938C66C">
       <w:start w:val="1"/>
       <w:numFmt w:val="upperLetter"/>
       <w:lvlText w:val="%1."/>
@@ -604,6 +677,8 @@
       </w:pPr>
       <w:rPr>
         <w:rFonts w:hint="default"/>
+        <w:b/>
+        <w:bCs/>
       </w:rPr>
     </w:lvl>
     <w:lvl w:ilvl="1" w:tplc="04090019" w:tentative="1">

</xml_diff>